<commit_message>
Switch the lecture's excitation method to swept-sine (chirp)
- Ch.4 restructured: chirp selected as the standard excitation, with
  design rules (log sweep, frequency range, sweep-rate criterion
  df/dt <= 0.1~0.2*(2*Dh*fh)^2, averaging, H1/coherence processing)
- New Fig.7: nonlinear simulation comparing a 60-s chirp (matches the
  stepped-sine reference) vs a 6-s chirp (smeared resonance peak)
- Ch.5 procedure rewritten as a chirp workflow (scout sweep, formal
  sweep, stepped-sine spot checks); later figures renumbered
- fig7 signals panel marks chirp as the selected method

Co-Authored-By: Claude Fable 5 <noreply@anthropic.com>
Claude-Session: https://claude.ai/code/session_01KPsbrKK1ewsSTpsx6QVie8
</commit_message>
<xml_diff>
--- a/液压缸频率响应测试讲解.docx
+++ b/液压缸频率响应测试讲解.docx
@@ -98,7 +98,7 @@
           <w:sz w:val="21"/>
         </w:rPr>
         <w:br/>
-        <w:t>“油缸频响测试”测的其实是“阀 + 缸 + 负载”这一整套系统的动态特性。本文先讲测什么、为什么（第 1 章），再讲理论上应当预期什么样的曲线（第 2 章），然后依次讲测试台架（第 3 章）、激励信号（第 4 章）、测试流程（第 5 章）、幅值依赖等非线性效应（第 6 章）、常见误差源排查（第 7 章）与结果解读（第 8 章）。文中仿真采用一个典型算例：缸径 50 mm 对称缸、行程 0.4 m、负载质量 500 kg、供油压力 210 bar，其液压固有频率约 22 Hz、阻尼比约 0.09，参数明细见附录。</w:t>
+        <w:t>“油缸频响测试”测的其实是“阀 + 缸 + 负载”这一整套系统的动态特性。本文先讲测什么、为什么（第 1 章），再讲理论上应当预期什么样的曲线（第 2 章），然后依次讲测试台架（第 3 章）、激励信号（第 4 章，本讲选用扫频 chirp，并给出扫频参数设计准则）、测试流程（第 5 章，按扫频工作流编写）、幅值依赖等非线性效应（第 6 章）、常见误差源排查（第 7 章）与结果解读（第 8 章）。文中仿真采用一个典型算例：缸径 50 mm 对称缸、行程 0.4 m、负载质量 500 kg、供油压力 210 bar，其液压固有频率约 22 Hz、阻尼比约 0.09，参数明细见附录。</w:t>
       </w:r>
     </w:p>
     <w:p>
@@ -2082,7 +2082,7 @@
           <w:color w:val="000000"/>
           <w:sz w:val="30"/>
         </w:rPr>
-        <w:t>4　激励信号的选择</w:t>
+        <w:t>4　激励信号：本讲选用扫频（chirp）</w:t>
       </w:r>
       <w:r>
         <w:t xml:space="preserve">  </w:t>
@@ -2094,7 +2094,7 @@
           <w:color w:val="555555"/>
           <w:sz w:val="21"/>
         </w:rPr>
-        <w:t>Choice of Excitation Signal</w:t>
+        <w:t>Excitation Signal: Chirp</w:t>
       </w:r>
     </w:p>
     <w:p>
@@ -2106,7 +2106,7 @@
         <w:rPr>
           <w:rFonts w:ascii="Times New Roman" w:hAnsi="Times New Roman" w:eastAsia="宋体"/>
         </w:rPr>
-        <w:t>激励信号决定了测试的速度、精度与对非线性的适应性，常用类型见图 6 与表 3；系统性的讨论见《液压伺服系统》中译本第 5 章（实验建模）。</w:t>
+        <w:t>激励信号决定了测试的速度、精度与对非线性的适应性，常用类型见图 6 与表 3；系统性的讨论见《液压伺服系统》中译本第 5 章（实验建模）。本讲选用扫频（chirp）作为标准激励方式，并在 4.2 节给出参数设计准则、4.3 节用仿真演示关键注意事项。</w:t>
       </w:r>
     </w:p>
     <w:p>
@@ -2160,7 +2160,7 @@
           <w:b/>
           <w:sz w:val="21"/>
         </w:rPr>
-        <w:t>图 6　频响测试常用激励信号：逐点定频正弦、扫频、多正弦与 PRBS</w:t>
+        <w:t>图 6　频响测试常用激励信号：逐点定频正弦、扫频（本讲选用）、多正弦与 PRBS</w:t>
       </w:r>
       <w:r>
         <w:rPr>
@@ -2170,7 +2170,7 @@
           <w:sz w:val="18"/>
         </w:rPr>
         <w:br/>
-        <w:t>(Figure 6. Common excitation signals: stepped sine, chirp, multisine, PRBS)</w:t>
+        <w:t>(Figure 6. Common excitation signals: stepped sine, chirp (used here), multisine, PRBS)</w:t>
       </w:r>
     </w:p>
     <w:tbl>
@@ -2275,6 +2275,66 @@
                 <w:rFonts w:ascii="Times New Roman" w:hAnsi="Times New Roman" w:eastAsia="宋体"/>
                 <w:sz w:val="20"/>
               </w:rPr>
+              <w:t>扫频 (chirp)</w:t>
+              <w:br/>
+              <w:t>【本讲选用】</w:t>
+            </w:r>
+          </w:p>
+        </w:tc>
+        <w:tc>
+          <w:tcPr>
+            <w:tcW w:type="dxa" w:w="2608"/>
+          </w:tcPr>
+          <w:p>
+            <w:r>
+              <w:rPr>
+                <w:rFonts w:ascii="Times New Roman" w:hAnsi="Times New Roman" w:eastAsia="宋体"/>
+                <w:sz w:val="20"/>
+              </w:rPr>
+              <w:t>一次连续扫过整个频段，测试时间短；频率覆盖无遗漏，谐振位置不会漏测；幅值单一、明确，便于分档考核非线性对象</w:t>
+            </w:r>
+          </w:p>
+        </w:tc>
+        <w:tc>
+          <w:tcPr>
+            <w:tcW w:type="dxa" w:w="2608"/>
+          </w:tcPr>
+          <w:p>
+            <w:r>
+              <w:rPr>
+                <w:rFonts w:ascii="Times New Roman" w:hAnsi="Times New Roman" w:eastAsia="宋体"/>
+                <w:sz w:val="20"/>
+              </w:rPr>
+              <w:t>扫速过快会“抹平”谐振峰（见 4.2/4.3 节准则）；单频驻留时间短，信噪比低于定频法</w:t>
+            </w:r>
+          </w:p>
+        </w:tc>
+        <w:tc>
+          <w:tcPr>
+            <w:tcW w:type="dxa" w:w="1928"/>
+          </w:tcPr>
+          <w:p>
+            <w:r>
+              <w:rPr>
+                <w:rFonts w:ascii="Times New Roman" w:hAnsi="Times New Roman" w:eastAsia="宋体"/>
+                <w:sz w:val="20"/>
+              </w:rPr>
+              <w:t>常规测试与复测；摸底后按准则正式采集</w:t>
+            </w:r>
+          </w:p>
+        </w:tc>
+      </w:tr>
+      <w:tr>
+        <w:tc>
+          <w:tcPr>
+            <w:tcW w:type="dxa" w:w="1928"/>
+          </w:tcPr>
+          <w:p>
+            <w:r>
+              <w:rPr>
+                <w:rFonts w:ascii="Times New Roman" w:hAnsi="Times New Roman" w:eastAsia="宋体"/>
+                <w:sz w:val="20"/>
+              </w:rPr>
               <w:t>逐点定频正弦</w:t>
               <w:br/>
               <w:t>(stepped sine)</w:t>
@@ -2319,65 +2379,7 @@
                 <w:rFonts w:ascii="Times New Roman" w:hAnsi="Times New Roman" w:eastAsia="宋体"/>
                 <w:sz w:val="20"/>
               </w:rPr>
-              <w:t>正式验收测试；非线性明显的对象</w:t>
-            </w:r>
-          </w:p>
-        </w:tc>
-      </w:tr>
-      <w:tr>
-        <w:tc>
-          <w:tcPr>
-            <w:tcW w:type="dxa" w:w="1928"/>
-          </w:tcPr>
-          <w:p>
-            <w:r>
-              <w:rPr>
-                <w:rFonts w:ascii="Times New Roman" w:hAnsi="Times New Roman" w:eastAsia="宋体"/>
-                <w:sz w:val="20"/>
-              </w:rPr>
-              <w:t>扫频 (chirp)</w:t>
-            </w:r>
-          </w:p>
-        </w:tc>
-        <w:tc>
-          <w:tcPr>
-            <w:tcW w:type="dxa" w:w="2608"/>
-          </w:tcPr>
-          <w:p>
-            <w:r>
-              <w:rPr>
-                <w:rFonts w:ascii="Times New Roman" w:hAnsi="Times New Roman" w:eastAsia="宋体"/>
-                <w:sz w:val="20"/>
-              </w:rPr>
-              <w:t>一次扫过整个频段，速度快</w:t>
-            </w:r>
-          </w:p>
-        </w:tc>
-        <w:tc>
-          <w:tcPr>
-            <w:tcW w:type="dxa" w:w="2608"/>
-          </w:tcPr>
-          <w:p>
-            <w:r>
-              <w:rPr>
-                <w:rFonts w:ascii="Times New Roman" w:hAnsi="Times New Roman" w:eastAsia="宋体"/>
-                <w:sz w:val="20"/>
-              </w:rPr>
-              <w:t>扫速过快会“抹平”谐振峰；幅值控制粗</w:t>
-            </w:r>
-          </w:p>
-        </w:tc>
-        <w:tc>
-          <w:tcPr>
-            <w:tcW w:type="dxa" w:w="1928"/>
-          </w:tcPr>
-          <w:p>
-            <w:r>
-              <w:rPr>
-                <w:rFonts w:ascii="Times New Roman" w:hAnsi="Times New Roman" w:eastAsia="宋体"/>
-                <w:sz w:val="20"/>
-              </w:rPr>
-              <w:t>摸底测试、快速复测</w:t>
+              <w:t>对扫频结果的复核（谐振区与考核频率点）；非线性严重的对象</w:t>
             </w:r>
           </w:p>
         </w:tc>
@@ -2506,6 +2508,32 @@
     </w:p>
     <w:p>
       <w:pPr>
+        <w:pStyle w:val="Heading2"/>
+      </w:pPr>
+      <w:r>
+        <w:rPr>
+          <w:rFonts w:ascii="Arial" w:hAnsi="Arial" w:eastAsia="黑体"/>
+          <w:b/>
+          <w:color w:val="000000"/>
+          <w:sz w:val="27"/>
+        </w:rPr>
+        <w:t>4.1　为什么选扫频</w:t>
+      </w:r>
+      <w:r>
+        <w:t xml:space="preserve">  </w:t>
+      </w:r>
+      <w:r>
+        <w:rPr>
+          <w:rFonts w:ascii="Arial" w:hAnsi="Arial" w:eastAsia="黑体"/>
+          <w:b w:val="0"/>
+          <w:color w:val="555555"/>
+          <w:sz w:val="20"/>
+        </w:rPr>
+        <w:t>Why Chirp</w:t>
+      </w:r>
+    </w:p>
+    <w:p>
+      <w:pPr>
         <w:spacing w:after="80"/>
         <w:ind w:firstLine="480"/>
       </w:pPr>
@@ -2513,7 +2541,303 @@
         <w:rPr>
           <w:rFonts w:ascii="Times New Roman" w:hAnsi="Times New Roman" w:eastAsia="宋体"/>
         </w:rPr>
-        <w:t>频率范围：从远低于预期带宽（如 0.1~1 Hz）测到 2~3 倍 ωh，按对数分布取点。使用随机类信号时务必检查相干函数 γ²：相干低于约 0.9 的频段说明噪声或非线性太强，该段数据不可信。</w:t>
+        <w:t>对液压缸这类对象，扫频在效率与可靠性之间折中最好：一次运行覆盖整个频段，不会像离散取点那样漏掉谐振峰的真实位置；总测试时间以分钟计，便于在多个幅值档、多个活塞位置下重复整套测试（这正是液压系统必须做的，见第 6 章）；与 PRBS/白噪声相比，扫频任意时刻只含单一频率、幅值明确，对强非线性对象的激励更充分、结果更易解释。其唯一的关键风险——扫速过快导致谐振峰失真——可以用下面的准则定量规避。</w:t>
+      </w:r>
+    </w:p>
+    <w:p>
+      <w:pPr>
+        <w:pStyle w:val="Heading2"/>
+      </w:pPr>
+      <w:r>
+        <w:rPr>
+          <w:rFonts w:ascii="Arial" w:hAnsi="Arial" w:eastAsia="黑体"/>
+          <w:b/>
+          <w:color w:val="000000"/>
+          <w:sz w:val="27"/>
+        </w:rPr>
+        <w:t>4.2　扫频参数设计</w:t>
+      </w:r>
+      <w:r>
+        <w:t xml:space="preserve">  </w:t>
+      </w:r>
+      <w:r>
+        <w:rPr>
+          <w:rFonts w:ascii="Arial" w:hAnsi="Arial" w:eastAsia="黑体"/>
+          <w:b w:val="0"/>
+          <w:color w:val="555555"/>
+          <w:sz w:val="20"/>
+        </w:rPr>
+        <w:t>Chirp Design Rules</w:t>
+      </w:r>
+    </w:p>
+    <w:p>
+      <w:pPr>
+        <w:pStyle w:val="ListBullet"/>
+        <w:spacing w:after="40"/>
+      </w:pPr>
+      <w:r>
+        <w:rPr>
+          <w:rFonts w:ascii="Times New Roman" w:hAnsi="Times New Roman" w:eastAsia="宋体"/>
+        </w:rPr>
+        <w:t>频率范围：从远低于预期带宽处开始（如 0.1~1 Hz，或 0.1 倍预期带宽），扫到 2~3 倍 ωh 结束。</w:t>
+      </w:r>
+    </w:p>
+    <w:p>
+      <w:pPr>
+        <w:pStyle w:val="ListBullet"/>
+        <w:spacing w:after="40"/>
+      </w:pPr>
+      <w:r>
+        <w:rPr>
+          <w:rFonts w:ascii="Times New Roman" w:hAnsi="Times New Roman" w:eastAsia="宋体"/>
+        </w:rPr>
+        <w:t>扫频律：优先用对数扫频（指数扫频），使每倍频程分配的时间基本相同；线性扫频会把绝大部分时间花在高频段而低频分辨率不足。</w:t>
+      </w:r>
+    </w:p>
+    <w:p>
+      <w:pPr>
+        <w:pStyle w:val="ListBullet"/>
+        <w:spacing w:after="40"/>
+      </w:pPr>
+      <w:r>
+        <w:rPr>
+          <w:rFonts w:ascii="Times New Roman" w:hAnsi="Times New Roman" w:eastAsia="宋体"/>
+        </w:rPr>
+        <w:t>扫速（核心准则）：谐振附近的瞬时扫速 df/dt 必须远小于谐振半功率带宽的平方，工程上取</w:t>
+      </w:r>
+    </w:p>
+    <w:p>
+      <w:pPr>
+        <w:tabs>
+          <w:tab w:pos="4592" w:val="center"/>
+          <w:tab w:pos="9184" w:val="right"/>
+        </w:tabs>
+        <w:spacing w:line="240" w:lineRule="auto" w:before="120" w:after="120"/>
+      </w:pPr>
+      <w:r>
+        <w:rPr>
+          <w:rFonts w:ascii="Times New Roman" w:hAnsi="Times New Roman" w:eastAsia="宋体"/>
+        </w:rPr>
+        <w:tab/>
+      </w:r>
+      <w:r>
+        <w:rPr>
+          <w:rFonts w:ascii="Times New Roman" w:hAnsi="Times New Roman" w:eastAsia="宋体"/>
+          <w:i w:val="0"/>
+          <w:sz w:val="24"/>
+        </w:rPr>
+        <w:t>df/dt ≤ (0.1~0.2)·Δf</w:t>
+      </w:r>
+      <w:r>
+        <w:rPr>
+          <w:rFonts w:ascii="Times New Roman" w:hAnsi="Times New Roman" w:eastAsia="宋体"/>
+          <w:i w:val="0"/>
+          <w:sz w:val="24"/>
+          <w:vertAlign w:val="superscript"/>
+        </w:rPr>
+        <w:t>2</w:t>
+      </w:r>
+      <w:r>
+        <w:rPr>
+          <w:rFonts w:ascii="Times New Roman" w:hAnsi="Times New Roman" w:eastAsia="宋体"/>
+          <w:i w:val="0"/>
+          <w:sz w:val="24"/>
+        </w:rPr>
+        <w:t>，　Δf = 2·D</w:t>
+      </w:r>
+      <w:r>
+        <w:rPr>
+          <w:rFonts w:ascii="Times New Roman" w:hAnsi="Times New Roman" w:eastAsia="宋体"/>
+          <w:i w:val="0"/>
+          <w:sz w:val="24"/>
+          <w:vertAlign w:val="subscript"/>
+        </w:rPr>
+        <w:t>h</w:t>
+      </w:r>
+      <w:r>
+        <w:rPr>
+          <w:rFonts w:ascii="Times New Roman" w:hAnsi="Times New Roman" w:eastAsia="宋体"/>
+          <w:i w:val="0"/>
+          <w:sz w:val="24"/>
+        </w:rPr>
+        <w:t>·f</w:t>
+      </w:r>
+      <w:r>
+        <w:rPr>
+          <w:rFonts w:ascii="Times New Roman" w:hAnsi="Times New Roman" w:eastAsia="宋体"/>
+          <w:i w:val="0"/>
+          <w:sz w:val="24"/>
+          <w:vertAlign w:val="subscript"/>
+        </w:rPr>
+        <w:t>h</w:t>
+      </w:r>
+      <w:r>
+        <w:rPr>
+          <w:rFonts w:ascii="Times New Roman" w:hAnsi="Times New Roman" w:eastAsia="宋体"/>
+        </w:rPr>
+        <w:tab/>
+        <w:t>(4.1)</w:t>
+      </w:r>
+    </w:p>
+    <w:p>
+      <w:pPr>
+        <w:spacing w:after="80"/>
+      </w:pPr>
+      <w:r>
+        <w:rPr>
+          <w:rFonts w:ascii="Times New Roman" w:hAnsi="Times New Roman" w:eastAsia="宋体"/>
+        </w:rPr>
+        <w:t>否则系统来不及在谐振频率上建立稳态振幅，测得的谐振峰被“抹平”且偏低。以本文算例（fh = 22.4 Hz，Dh ≈ 0.09，Δf ≈ 4 Hz）作 0.3~40 Hz 对数扫频，按式 4.1 需要总扫描时长 T ≥ 30~60 s——见 4.3 节的仿真验证。阻尼越小（谐振峰越尖），要求的扫速越慢。</w:t>
+      </w:r>
+    </w:p>
+    <w:p>
+      <w:pPr>
+        <w:pStyle w:val="ListBullet"/>
+        <w:spacing w:after="40"/>
+      </w:pPr>
+      <w:r>
+        <w:rPr>
+          <w:rFonts w:ascii="Times New Roman" w:hAnsi="Times New Roman" w:eastAsia="宋体"/>
+        </w:rPr>
+        <w:t>幅值：整个扫描过程保持幅值恒定；按第 6 章的要求分小、中、大档各扫一遍。</w:t>
+      </w:r>
+    </w:p>
+    <w:p>
+      <w:pPr>
+        <w:pStyle w:val="ListBullet"/>
+        <w:spacing w:after="40"/>
+      </w:pPr>
+      <w:r>
+        <w:rPr>
+          <w:rFonts w:ascii="Times New Roman" w:hAnsi="Times New Roman" w:eastAsia="宋体"/>
+        </w:rPr>
+        <w:t>重复与平均：同一工况重复 2~3 次扫描，谱平均以抑制噪声。</w:t>
+      </w:r>
+    </w:p>
+    <w:p>
+      <w:pPr>
+        <w:pStyle w:val="ListBullet"/>
+        <w:spacing w:after="40"/>
+      </w:pPr>
+      <w:r>
+        <w:rPr>
+          <w:rFonts w:ascii="Times New Roman" w:hAnsi="Times New Roman" w:eastAsia="宋体"/>
+        </w:rPr>
+        <w:t>处理：对输入（参考）与输出作分段加窗（Hann）谱估计，用 H1 估计求频响，同时计算相干函数 γ²；相干低于约 0.9 的频段说明噪声、非线性或扫速问题，该段数据不可信，应放慢扫速或改用定频复核。</w:t>
+      </w:r>
+    </w:p>
+    <w:p>
+      <w:pPr>
+        <w:pStyle w:val="Heading2"/>
+      </w:pPr>
+      <w:r>
+        <w:rPr>
+          <w:rFonts w:ascii="Arial" w:hAnsi="Arial" w:eastAsia="黑体"/>
+          <w:b/>
+          <w:color w:val="000000"/>
+          <w:sz w:val="27"/>
+        </w:rPr>
+        <w:t>4.3　扫速的影响：仿真演示</w:t>
+      </w:r>
+      <w:r>
+        <w:t xml:space="preserve">  </w:t>
+      </w:r>
+      <w:r>
+        <w:rPr>
+          <w:rFonts w:ascii="Arial" w:hAnsi="Arial" w:eastAsia="黑体"/>
+          <w:b w:val="0"/>
+          <w:color w:val="555555"/>
+          <w:sz w:val="20"/>
+        </w:rPr>
+        <w:t>Sweep-rate Effect: a Simulation</w:t>
+      </w:r>
+    </w:p>
+    <w:p>
+      <w:pPr>
+        <w:spacing w:after="80"/>
+        <w:ind w:firstLine="480"/>
+      </w:pPr>
+      <w:r>
+        <w:rPr>
+          <w:rFonts w:ascii="Times New Roman" w:hAnsi="Times New Roman" w:eastAsia="宋体"/>
+        </w:rPr>
+        <w:t>图 7 用本文算例的非线性模型演示扫速的影响（±5 mm 幅值，H1 谱估计）：60 s 的对数扫频（满足式 4.1）与逐点定频正弦基准完全吻合，包括谐振峰；同样的信号压缩到 6 s，低频段看似无恙，谐振峰却被明显抹平、峰值偏低——这种数据拿去设计控制器会高估稳定裕度。图中还可看到，两条非线性结果的谐振峰都低于无摩擦线性模型：这不是测试误差，而是真实摩擦提供的附加阻尼，正说明实测频响比纯理论模型更可信。</w:t>
+      </w:r>
+    </w:p>
+    <w:p>
+      <w:pPr>
+        <w:spacing w:before="120"/>
+        <w:jc w:val="center"/>
+      </w:pPr>
+      <w:r>
+        <w:drawing>
+          <wp:inline xmlns:a="http://schemas.openxmlformats.org/drawingml/2006/main" xmlns:pic="http://schemas.openxmlformats.org/drawingml/2006/picture">
+            <wp:extent cx="5688000" cy="2600229"/>
+            <wp:docPr id="7" name="Picture 7"/>
+            <wp:cNvGraphicFramePr>
+              <a:graphicFrameLocks noChangeAspect="1"/>
+            </wp:cNvGraphicFramePr>
+            <a:graphic>
+              <a:graphicData uri="http://schemas.openxmlformats.org/drawingml/2006/picture">
+                <pic:pic>
+                  <pic:nvPicPr>
+                    <pic:cNvPr id="0" name="fig9_chirp.png"/>
+                    <pic:cNvPicPr/>
+                  </pic:nvPicPr>
+                  <pic:blipFill>
+                    <a:blip r:embed="rId15"/>
+                    <a:stretch>
+                      <a:fillRect/>
+                    </a:stretch>
+                  </pic:blipFill>
+                  <pic:spPr>
+                    <a:xfrm>
+                      <a:off x="0" y="0"/>
+                      <a:ext cx="5688000" cy="2600229"/>
+                    </a:xfrm>
+                    <a:prstGeom prst="rect"/>
+                  </pic:spPr>
+                </pic:pic>
+              </a:graphicData>
+            </a:graphic>
+          </wp:inline>
+        </w:drawing>
+      </w:r>
+    </w:p>
+    <w:p>
+      <w:pPr>
+        <w:spacing w:after="200"/>
+        <w:jc w:val="center"/>
+      </w:pPr>
+      <w:r>
+        <w:rPr>
+          <w:rFonts w:ascii="Times New Roman" w:hAnsi="Times New Roman" w:eastAsia="宋体"/>
+          <w:b/>
+          <w:sz w:val="21"/>
+        </w:rPr>
+        <w:t>图 7　扫频测试的关键——扫速必须足够慢：60 s 扫频与定频基准吻合，6 s 扫频谐振峰失真</w:t>
+      </w:r>
+      <w:r>
+        <w:rPr>
+          <w:rFonts w:ascii="Times New Roman" w:hAnsi="Times New Roman" w:eastAsia="宋体"/>
+          <w:i/>
+          <w:color w:val="666666"/>
+          <w:sz w:val="18"/>
+        </w:rPr>
+        <w:br/>
+        <w:t>(Figure 7. Sweep-rate effect: a 60-s chirp matches the stepped-sine reference while a 6-s chirp smears the resonance)</w:t>
+      </w:r>
+    </w:p>
+    <w:p>
+      <w:pPr>
+        <w:spacing w:after="80"/>
+        <w:ind w:firstLine="480"/>
+      </w:pPr>
+      <w:r>
+        <w:rPr>
+          <w:rFonts w:ascii="Times New Roman" w:hAnsi="Times New Roman" w:eastAsia="宋体"/>
+        </w:rPr>
+        <w:t>实用建议：正式测试前先做一次快扫摸底（确认谐振大致位置与安全性），再按式 4.1 设定扫速正式采集；出报告前在谐振区和考核频率点用逐点定频正弦复核若干点。</w:t>
       </w:r>
     </w:p>
     <w:p>
@@ -2552,7 +2876,7 @@
         <w:rPr>
           <w:rFonts w:ascii="Times New Roman" w:hAnsi="Times New Roman" w:eastAsia="宋体"/>
         </w:rPr>
-        <w:t>推荐按以下步骤执行（以逐点定频正弦、位置闭环方式为例）：</w:t>
+        <w:t>推荐按以下步骤执行（以扫频 chirp 激励、位置闭环方式为例）：</w:t>
       </w:r>
     </w:p>
     <w:p>
@@ -2598,7 +2922,7 @@
         <w:rPr>
           <w:rFonts w:ascii="Times New Roman" w:hAnsi="Times New Roman" w:eastAsia="宋体"/>
         </w:rPr>
-        <w:t>这是频响测试最常见、影响最大的误差源：混入空气使 βe 急剧下降，测得的 ωh 明显偏低（见第 7 章图 8）。在两腔最高点排气，必要时低压往复运行冲洗。</w:t>
+        <w:t>这是频响测试最常见、影响最大的误差源：混入空气使 βe 急剧下降，测得的 ωh 明显偏低（见第 7 章图 9）。在两腔最高点排气，必要时低压往复运行冲洗。</w:t>
       </w:r>
     </w:p>
     <w:p>
@@ -2633,7 +2957,7 @@
           <w:rFonts w:ascii="Times New Roman" w:hAnsi="Times New Roman" w:eastAsia="宋体"/>
           <w:b/>
         </w:rPr>
-        <w:t>（4）从低频、小幅值开始叠加激励。</w:t>
+        <w:t>（4）小幅值快扫摸底，再按准则正式扫频。</w:t>
       </w:r>
     </w:p>
     <w:p>
@@ -2644,7 +2968,7 @@
         <w:rPr>
           <w:rFonts w:ascii="Times New Roman" w:hAnsi="Times New Roman" w:eastAsia="宋体"/>
         </w:rPr>
-        <w:t>每个频率点等待 5~10 个周期进入稳态后再取数；用相关法或跟踪滤波只提取基波分量，计算幅值比与相位差。逐步升频经过谐振区时注意监视振幅与两腔压力，必要时降低幅值。</w:t>
+        <w:t>先用小幅值做一次较快的扫描，确认谐振大致位置、无异常振动与报警；然后按式 4.1 设定扫速（本文算例 0.3~40 Hz 对数扫频需 T ≥ 30~60 s），正式采集并重复 2~3 次。扫描经过谐振区时监视振幅与两腔压力，必要时中断并降低幅值。</w:t>
       </w:r>
     </w:p>
     <w:p>
@@ -2656,7 +2980,7 @@
           <w:rFonts w:ascii="Times New Roman" w:hAnsi="Times New Roman" w:eastAsia="宋体"/>
           <w:b/>
         </w:rPr>
-        <w:t>（5）更换激励幅值重复。</w:t>
+        <w:t>（5）更换激励幅值重复扫频。</w:t>
       </w:r>
     </w:p>
     <w:p>
@@ -2702,7 +3026,7 @@
         <w:rPr>
           <w:rFonts w:ascii="Times New Roman" w:hAnsi="Times New Roman" w:eastAsia="宋体"/>
         </w:rPr>
-        <w:t>绘制 Bode 图，读取 −3 dB 带宽、−90° 相位频率、谐振频率与峰值；需要模型时用频域辨识工具拟合式 2.1 的参数（ωh、Dh、Kv），作为建模与控制器设计的依据。</w:t>
+        <w:t>对参考与响应信号作 H1 谱估计（Hann 窗、分段平均）得到 Bode 图，检查相干函数并剔除 γ² &lt; 0.9 的频段；在谐振区与考核频率点用逐点定频正弦复核；读取 −3 dB 带宽、−90° 相位频率、谐振频率与峰值；需要模型时用频域辨识工具拟合式 2.1 的参数（ωh、Dh、Kv），作为建模与控制器设计的依据。</w:t>
       </w:r>
     </w:p>
     <w:p/>
@@ -2769,7 +3093,7 @@
         <w:rPr>
           <w:rFonts w:ascii="Times New Roman" w:hAnsi="Times New Roman" w:eastAsia="宋体"/>
         </w:rPr>
-        <w:t>液压系统的核心非线性包括：阀口流量与压差的平方根关系、流量饱和（速度极限）、阀遮盖/死区、摩擦与滞环。因此同一套系统在不同激励幅值下测得的频响并不相同，“带宽”只有连同幅值一起说明才有意义。图 7 是对本文算例的非线性模型做的仿真（位置闭环 + P 控制器，逐点正弦、相关法提取基波，方法与真实测试完全相同）：</w:t>
+        <w:t>液压系统的核心非线性包括：阀口流量与压差的平方根关系、流量饱和（速度极限）、阀遮盖/死区、摩擦与滞环。因此同一套系统在不同激励幅值下测得的频响并不相同，“带宽”只有连同幅值一起说明才有意义。图 8 是对本文算例的非线性模型做的仿真（位置闭环 + P 控制器，逐点定频正弦、相关法提取基波——该方法作为基准最精细；4.3 节图 7 已验证扫速合适的扫频给出与之一致的结果）：</w:t>
       </w:r>
     </w:p>
     <w:p>
@@ -2817,7 +3141,7 @@
         <w:drawing>
           <wp:inline xmlns:a="http://schemas.openxmlformats.org/drawingml/2006/main" xmlns:pic="http://schemas.openxmlformats.org/drawingml/2006/picture">
             <wp:extent cx="5688000" cy="2272597"/>
-            <wp:docPr id="7" name="Picture 7"/>
+            <wp:docPr id="8" name="Picture 8"/>
             <wp:cNvGraphicFramePr>
               <a:graphicFrameLocks noChangeAspect="1"/>
             </wp:cNvGraphicFramePr>
@@ -2829,7 +3153,7 @@
                     <pic:cNvPicPr/>
                   </pic:nvPicPr>
                   <pic:blipFill>
-                    <a:blip r:embed="rId15"/>
+                    <a:blip r:embed="rId16"/>
                     <a:stretch>
                       <a:fillRect/>
                     </a:stretch>
@@ -2859,7 +3183,7 @@
           <w:b/>
           <w:sz w:val="21"/>
         </w:rPr>
-        <w:t>图 7　非线性模型仿真：不同激励幅值下测得的频响（虚线为线性小信号模型）</w:t>
+        <w:t>图 8　非线性模型仿真：不同激励幅值下测得的频响（虚线为线性小信号模型）</w:t>
       </w:r>
       <w:r>
         <w:rPr>
@@ -2869,7 +3193,7 @@
           <w:sz w:val="18"/>
         </w:rPr>
         <w:br/>
-        <w:t>(Figure 7. Nonlinear simulation: measured FRF at different excitation amplitudes (dashed: linear small-signal model))</w:t>
+        <w:t>(Figure 8. Nonlinear simulation: measured FRF at different excitation amplitudes (dashed: linear small-signal model))</w:t>
       </w:r>
     </w:p>
     <w:p>
@@ -3004,7 +3328,7 @@
         <w:rPr>
           <w:rFonts w:ascii="Times New Roman" w:hAnsi="Times New Roman" w:eastAsia="宋体"/>
         </w:rPr>
-        <w:t>其中 α 为测试压力下的体积含气率，κ ≈ 1.4 为气体多变指数，p 为腔内绝对压力。由式 2.2，ωh 随 √βeff 变化：图 8 显示在 100 bar 下仅 0.5% 的含气量就使谐振频率从 22.4 Hz 降到约 18 Hz，2% 时降到约 13 Hz。压力越低影响越剧烈。若实测 ωh 明显低于按式 2.2 的估算值，先查空气，再怀疑其他。</w:t>
+        <w:t>其中 α 为测试压力下的体积含气率，κ ≈ 1.4 为气体多变指数，p 为腔内绝对压力。由式 2.2，ωh 随 √βeff 变化：图 9 显示在 100 bar 下仅 0.5% 的含气量就使谐振频率从 22.4 Hz 降到约 18 Hz，2% 时降到约 13 Hz。压力越低影响越剧烈。若实测 ωh 明显低于按式 2.2 的估算值，先查空气，再怀疑其他。</w:t>
       </w:r>
     </w:p>
     <w:p>
@@ -3016,7 +3340,7 @@
         <w:drawing>
           <wp:inline xmlns:a="http://schemas.openxmlformats.org/drawingml/2006/main" xmlns:pic="http://schemas.openxmlformats.org/drawingml/2006/picture">
             <wp:extent cx="5688000" cy="2176278"/>
-            <wp:docPr id="8" name="Picture 8"/>
+            <wp:docPr id="9" name="Picture 9"/>
             <wp:cNvGraphicFramePr>
               <a:graphicFrameLocks noChangeAspect="1"/>
             </wp:cNvGraphicFramePr>
@@ -3028,7 +3352,7 @@
                     <pic:cNvPicPr/>
                   </pic:nvPicPr>
                   <pic:blipFill>
-                    <a:blip r:embed="rId16"/>
+                    <a:blip r:embed="rId17"/>
                     <a:stretch>
                       <a:fillRect/>
                     </a:stretch>
@@ -3058,7 +3382,7 @@
           <w:b/>
           <w:sz w:val="21"/>
         </w:rPr>
-        <w:t>图 8　含气量对有效体积弹性模量与测得谐振频率的影响</w:t>
+        <w:t>图 9　含气量对有效体积弹性模量与测得谐振频率的影响</w:t>
       </w:r>
       <w:r>
         <w:rPr>
@@ -3068,7 +3392,7 @@
           <w:sz w:val="18"/>
         </w:rPr>
         <w:br/>
-        <w:t>(Figure 8. Effect of entrained air on effective bulk modulus and measured resonance)</w:t>
+        <w:t>(Figure 9. Effect of entrained air on effective bulk modulus and measured resonance)</w:t>
       </w:r>
     </w:p>
     <w:tbl>
@@ -3684,7 +4008,7 @@
         <w:rPr>
           <w:rFonts w:ascii="Times New Roman" w:hAnsi="Times New Roman" w:eastAsia="宋体"/>
         </w:rPr>
-        <w:t>文中图 2~4、图 7、图 8 均基于下列同一算例计算/仿真（脚本 make_freq_response_figs.py）：</w:t>
+        <w:t>文中图 2~4 与图 7~9 均基于下列同一算例计算/仿真（脚本 make_freq_response_figs.py）：</w:t>
       </w:r>
     </w:p>
     <w:tbl>
@@ -4789,7 +5113,7 @@
         <w:rPr>
           <w:rFonts w:ascii="Times New Roman" w:hAnsi="Times New Roman" w:eastAsia="宋体"/>
         </w:rPr>
-        <w:t>非线性仿真模型包括：阀口流量的平方根压差特性与流量饱和、阀二阶动态、阀遮盖死区、库仑 + 黏性摩擦、腔室压力动态；求解采用四阶 Runge-Kutta（步长 ≤ 0.2 ms），逐频率点仿真至稳态后用相关法提取基波，与真实测试的处理方法一致。</w:t>
+        <w:t>非线性仿真模型包括：阀口流量的平方根压差特性与流量饱和、阀二阶动态、阀遮盖死区、库仑 + 黏性摩擦、腔室压力动态；求解采用四阶 Runge-Kutta（步长 ≤ 0.2 ms）。定频仿真逐频率点算至稳态后用相关法提取基波；扫频仿真（图 7）用 Hann 窗分段 H1 谱估计处理，与实测流程一致。</w:t>
       </w:r>
     </w:p>
     <w:sectPr>

</xml_diff>